<commit_message>
image, cv docs, stelse were chanegd
</commit_message>
<xml_diff>
--- a/Kolotko_V_V-CV-en.docx
+++ b/Kolotko_V_V-CV-en.docx
@@ -56,16 +56,7 @@
           <w:szCs w:val="28"/>
           <w:lang w:val="en-US"/>
         </w:rPr>
-        <w:t>:</w:t>
-      </w:r>
-      <w:r>
-        <w:rPr>
-          <w:b/>
-          <w:sz w:val="28"/>
-          <w:szCs w:val="28"/>
-          <w:lang w:val="uk-UA"/>
-        </w:rPr>
-        <w:t xml:space="preserve"> +48 453 333 446</w:t>
+        <w:t>: 066</w:t>
       </w:r>
       <w:r>
         <w:rPr>
@@ -74,7 +65,7 @@
           <w:szCs w:val="28"/>
           <w:lang w:val="en-US"/>
         </w:rPr>
-        <w:t xml:space="preserve">; </w:t>
+        <w:t>-</w:t>
       </w:r>
       <w:r>
         <w:rPr>
@@ -83,7 +74,7 @@
           <w:szCs w:val="28"/>
           <w:lang w:val="en-US"/>
         </w:rPr>
-        <w:t>+38 098 </w:t>
+        <w:t>881-95-58</w:t>
       </w:r>
       <w:r>
         <w:rPr>
@@ -92,7 +83,7 @@
           <w:szCs w:val="28"/>
           <w:lang w:val="en-US"/>
         </w:rPr>
-        <w:t>856</w:t>
+        <w:t xml:space="preserve"> (Viber, Telegram)</w:t>
       </w:r>
       <w:r>
         <w:rPr>
@@ -101,7 +92,7 @@
           <w:szCs w:val="28"/>
           <w:lang w:val="en-US"/>
         </w:rPr>
-        <w:t xml:space="preserve"> </w:t>
+        <w:t xml:space="preserve">; </w:t>
       </w:r>
       <w:r>
         <w:rPr>
@@ -110,97 +101,7 @@
           <w:szCs w:val="28"/>
           <w:lang w:val="en-US"/>
         </w:rPr>
-        <w:t>25</w:t>
-      </w:r>
-      <w:r>
-        <w:rPr>
-          <w:b/>
-          <w:sz w:val="28"/>
-          <w:szCs w:val="28"/>
-          <w:lang w:val="en-US"/>
-        </w:rPr>
-        <w:t xml:space="preserve"> </w:t>
-      </w:r>
-      <w:r>
-        <w:rPr>
-          <w:b/>
-          <w:sz w:val="28"/>
-          <w:szCs w:val="28"/>
-          <w:lang w:val="en-US"/>
-        </w:rPr>
-        <w:t>45</w:t>
-      </w:r>
-      <w:r>
-        <w:rPr>
-          <w:b/>
-          <w:sz w:val="28"/>
-          <w:szCs w:val="28"/>
-          <w:lang w:val="en-US"/>
-        </w:rPr>
-        <w:t>; +38 </w:t>
-      </w:r>
-      <w:r>
-        <w:rPr>
-          <w:b/>
-          <w:sz w:val="28"/>
-          <w:szCs w:val="28"/>
-          <w:lang w:val="en-US"/>
-        </w:rPr>
-        <w:t>066</w:t>
-      </w:r>
-      <w:r>
-        <w:rPr>
-          <w:b/>
-          <w:sz w:val="28"/>
-          <w:szCs w:val="28"/>
-          <w:lang w:val="en-US"/>
-        </w:rPr>
-        <w:t> </w:t>
-      </w:r>
-      <w:r>
-        <w:rPr>
-          <w:b/>
-          <w:sz w:val="28"/>
-          <w:szCs w:val="28"/>
-          <w:lang w:val="en-US"/>
-        </w:rPr>
-        <w:t>881</w:t>
-      </w:r>
-      <w:r>
-        <w:rPr>
-          <w:b/>
-          <w:sz w:val="28"/>
-          <w:szCs w:val="28"/>
-          <w:lang w:val="en-US"/>
-        </w:rPr>
-        <w:t xml:space="preserve"> </w:t>
-      </w:r>
-      <w:r>
-        <w:rPr>
-          <w:b/>
-          <w:sz w:val="28"/>
-          <w:szCs w:val="28"/>
-          <w:lang w:val="en-US"/>
-        </w:rPr>
-        <w:t>95</w:t>
-      </w:r>
-      <w:r>
-        <w:rPr>
-          <w:b/>
-          <w:sz w:val="28"/>
-          <w:szCs w:val="28"/>
-          <w:lang w:val="en-US"/>
-        </w:rPr>
-        <w:t xml:space="preserve"> </w:t>
-      </w:r>
-      <w:r>
-        <w:rPr>
-          <w:b/>
-          <w:sz w:val="28"/>
-          <w:szCs w:val="28"/>
-          <w:lang w:val="en-US"/>
-        </w:rPr>
-        <w:t>58 (Viber, Telegram)</w:t>
+        <w:t>098-856-25-45</w:t>
       </w:r>
     </w:p>
     <w:p>
@@ -340,6 +241,7 @@
             <w:rStyle w:val="a9"/>
             <w:sz w:val="24"/>
             <w:szCs w:val="24"/>
+            <w:lang w:val="en-US"/>
           </w:rPr>
           <w:t>https</w:t>
         </w:r>
@@ -352,14 +254,17 @@
           </w:rPr>
           <w:t>://</w:t>
         </w:r>
+        <w:proofErr w:type="spellStart"/>
         <w:r>
           <w:rPr>
             <w:rStyle w:val="a9"/>
             <w:sz w:val="24"/>
             <w:szCs w:val="24"/>
+            <w:lang w:val="en-US"/>
           </w:rPr>
           <w:t>vladka</w:t>
         </w:r>
+        <w:proofErr w:type="spellEnd"/>
         <w:r>
           <w:rPr>
             <w:rStyle w:val="a9"/>
@@ -374,59 +279,9 @@
             <w:rStyle w:val="a9"/>
             <w:sz w:val="24"/>
             <w:szCs w:val="24"/>
+            <w:lang w:val="en-US"/>
           </w:rPr>
           <w:t>k</w:t>
-        </w:r>
-        <w:r>
-          <w:rPr>
-            <w:rStyle w:val="a9"/>
-            <w:sz w:val="24"/>
-            <w:szCs w:val="24"/>
-            <w:lang w:val="uk-UA"/>
-          </w:rPr>
-          <w:t>.</w:t>
-        </w:r>
-        <w:r>
-          <w:rPr>
-            <w:rStyle w:val="a9"/>
-            <w:sz w:val="24"/>
-            <w:szCs w:val="24"/>
-          </w:rPr>
-          <w:t>github</w:t>
-        </w:r>
-        <w:r>
-          <w:rPr>
-            <w:rStyle w:val="a9"/>
-            <w:sz w:val="24"/>
-            <w:szCs w:val="24"/>
-            <w:lang w:val="uk-UA"/>
-          </w:rPr>
-          <w:t>.</w:t>
-        </w:r>
-        <w:r>
-          <w:rPr>
-            <w:rStyle w:val="a9"/>
-            <w:sz w:val="24"/>
-            <w:szCs w:val="24"/>
-          </w:rPr>
-          <w:t>io</w:t>
-        </w:r>
-        <w:r>
-          <w:rPr>
-            <w:rStyle w:val="a9"/>
-            <w:sz w:val="24"/>
-            <w:szCs w:val="24"/>
-            <w:lang w:val="uk-UA"/>
-          </w:rPr>
-          <w:t>/</w:t>
-        </w:r>
-        <w:r>
-          <w:rPr>
-            <w:rStyle w:val="a9"/>
-            <w:sz w:val="24"/>
-            <w:szCs w:val="24"/>
-          </w:rPr>
-          <w:t>en</w:t>
         </w:r>
         <w:r>
           <w:rPr>
@@ -443,10 +298,40 @@
             <w:rStyle w:val="a9"/>
             <w:sz w:val="24"/>
             <w:szCs w:val="24"/>
+            <w:lang w:val="en-US"/>
           </w:rPr>
-          <w:t>html</w:t>
+          <w:t>github</w:t>
         </w:r>
         <w:proofErr w:type="spellEnd"/>
+        <w:r>
+          <w:rPr>
+            <w:rStyle w:val="a9"/>
+            <w:sz w:val="24"/>
+            <w:szCs w:val="24"/>
+            <w:lang w:val="uk-UA"/>
+          </w:rPr>
+          <w:t>.</w:t>
+        </w:r>
+        <w:proofErr w:type="spellStart"/>
+        <w:r>
+          <w:rPr>
+            <w:rStyle w:val="a9"/>
+            <w:sz w:val="24"/>
+            <w:szCs w:val="24"/>
+            <w:lang w:val="en-US"/>
+          </w:rPr>
+          <w:t>io</w:t>
+        </w:r>
+        <w:proofErr w:type="spellEnd"/>
+        <w:r>
+          <w:rPr>
+            <w:rStyle w:val="a9"/>
+            <w:sz w:val="24"/>
+            <w:szCs w:val="24"/>
+            <w:lang w:val="uk-UA"/>
+          </w:rPr>
+          <w:t>/</w:t>
+        </w:r>
       </w:hyperlink>
     </w:p>
     <w:tbl>
@@ -640,9 +525,8 @@
                 <w:szCs w:val="24"/>
                 <w:lang w:val="en-US"/>
               </w:rPr>
-              <w:t xml:space="preserve">Since March 2021, I have been working as a Front End/Markup (HTML, CSS) developer on projects for the European and American markets, focusing on creating </w:t>
-            </w:r>
-            <w:proofErr w:type="gramStart"/>
+              <w:t xml:space="preserve">In 2013 </w:t>
+            </w:r>
             <w:r>
               <w:rPr>
                 <w:b w:val="0"/>
@@ -650,9 +534,9 @@
                 <w:szCs w:val="24"/>
                 <w:lang w:val="en-US"/>
               </w:rPr>
-              <w:t>responsive,</w:t>
-            </w:r>
-            <w:proofErr w:type="gramEnd"/>
+              <w:t xml:space="preserve">graduated from </w:t>
+            </w:r>
+            <w:proofErr w:type="spellStart"/>
             <w:r>
               <w:rPr>
                 <w:b w:val="0"/>
@@ -660,9 +544,8 @@
                 <w:szCs w:val="24"/>
                 <w:lang w:val="en-US"/>
               </w:rPr>
-              <w:t xml:space="preserve"> and visually appealing web interfaces. My work includes developing sections and pages of websites based on </w:t>
-            </w:r>
-            <w:proofErr w:type="spellStart"/>
+              <w:t>K</w:t>
+            </w:r>
             <w:r>
               <w:rPr>
                 <w:b w:val="0"/>
@@ -670,7 +553,16 @@
                 <w:szCs w:val="24"/>
                 <w:lang w:val="en-US"/>
               </w:rPr>
-              <w:t>Figma</w:t>
+              <w:t>h</w:t>
+            </w:r>
+            <w:r>
+              <w:rPr>
+                <w:b w:val="0"/>
+                <w:sz w:val="24"/>
+                <w:szCs w:val="24"/>
+                <w:lang w:val="en-US"/>
+              </w:rPr>
+              <w:t>NEU</w:t>
             </w:r>
             <w:proofErr w:type="spellEnd"/>
             <w:r>
@@ -680,7 +572,25 @@
                 <w:szCs w:val="24"/>
                 <w:lang w:val="en-US"/>
               </w:rPr>
-              <w:t xml:space="preserve"> layouts, utilizing technologies such as HTML, SCSS, Tailwind, jQuery, and JavaScript to ensure precision and seamless functionality. I am involved in web projects by developing and refining existing blocks, sections, components, and pages. In addition, I am involved in styling standard WordPress components according to design specifications, maintaining uniformity across the websites.</w:t>
+              <w:t xml:space="preserve"> </w:t>
+            </w:r>
+            <w:r>
+              <w:rPr>
+                <w:b w:val="0"/>
+                <w:sz w:val="24"/>
+                <w:szCs w:val="24"/>
+                <w:lang w:val="en-US"/>
+              </w:rPr>
+              <w:t>with a degree in Administrati</w:t>
+            </w:r>
+            <w:r>
+              <w:rPr>
+                <w:b w:val="0"/>
+                <w:sz w:val="24"/>
+                <w:szCs w:val="24"/>
+                <w:lang w:val="en-US"/>
+              </w:rPr>
+              <w:t>ve Management (“Master” level).</w:t>
             </w:r>
           </w:p>
           <w:p>
@@ -726,7 +636,153 @@
                 <w:szCs w:val="24"/>
                 <w:lang w:val="en-US"/>
               </w:rPr>
-              <w:t>Since 2018 I worked as SEO specialist in the internet marketing agency. I started as SEO assistant with minimal knowledge and no experience in this field.</w:t>
+              <w:t>Sinc</w:t>
+            </w:r>
+            <w:r>
+              <w:rPr>
+                <w:b w:val="0"/>
+                <w:sz w:val="24"/>
+                <w:szCs w:val="24"/>
+                <w:lang w:val="en-US"/>
+              </w:rPr>
+              <w:t>e 2018 I work</w:t>
+            </w:r>
+            <w:r>
+              <w:rPr>
+                <w:b w:val="0"/>
+                <w:sz w:val="24"/>
+                <w:szCs w:val="24"/>
+                <w:lang w:val="en-US"/>
+              </w:rPr>
+              <w:t>ed</w:t>
+            </w:r>
+            <w:r>
+              <w:rPr>
+                <w:b w:val="0"/>
+                <w:sz w:val="24"/>
+                <w:szCs w:val="24"/>
+                <w:lang w:val="en-US"/>
+              </w:rPr>
+              <w:t xml:space="preserve"> as</w:t>
+            </w:r>
+            <w:r>
+              <w:rPr>
+                <w:b w:val="0"/>
+                <w:sz w:val="24"/>
+                <w:szCs w:val="24"/>
+                <w:lang w:val="en-US"/>
+              </w:rPr>
+              <w:t xml:space="preserve"> SEO specialist in </w:t>
+            </w:r>
+            <w:r>
+              <w:rPr>
+                <w:b w:val="0"/>
+                <w:sz w:val="24"/>
+                <w:szCs w:val="24"/>
+                <w:lang w:val="en-US"/>
+              </w:rPr>
+              <w:t>the</w:t>
+            </w:r>
+            <w:r>
+              <w:rPr>
+                <w:b w:val="0"/>
+                <w:sz w:val="24"/>
+                <w:szCs w:val="24"/>
+                <w:lang w:val="en-US"/>
+              </w:rPr>
+              <w:t xml:space="preserve"> internet marketing agency. I started as SEO assistant with minimal knowledge and no experience in this field. Constant learning and work on </w:t>
+            </w:r>
+            <w:proofErr w:type="gramStart"/>
+            <w:r>
+              <w:rPr>
+                <w:b w:val="0"/>
+                <w:sz w:val="24"/>
+                <w:szCs w:val="24"/>
+                <w:lang w:val="en-US"/>
+              </w:rPr>
+              <w:t>myself</w:t>
+            </w:r>
+            <w:proofErr w:type="gramEnd"/>
+            <w:r>
+              <w:rPr>
+                <w:b w:val="0"/>
+                <w:sz w:val="24"/>
+                <w:szCs w:val="24"/>
+                <w:lang w:val="en-US"/>
+              </w:rPr>
+              <w:t xml:space="preserve"> have already become a habit and have allowed me to grow to a full-fledged sp</w:t>
+            </w:r>
+            <w:r>
+              <w:rPr>
+                <w:b w:val="0"/>
+                <w:sz w:val="24"/>
+                <w:szCs w:val="24"/>
+                <w:lang w:val="en-US"/>
+              </w:rPr>
+              <w:t xml:space="preserve">ecialist. In addition, since </w:t>
+            </w:r>
+            <w:r>
+              <w:rPr>
+                <w:b w:val="0"/>
+                <w:sz w:val="24"/>
+                <w:szCs w:val="24"/>
+                <w:lang w:val="en-US"/>
+              </w:rPr>
+              <w:t>year</w:t>
+            </w:r>
+            <w:r>
+              <w:rPr>
+                <w:b w:val="0"/>
+                <w:sz w:val="24"/>
+                <w:szCs w:val="24"/>
+                <w:lang w:val="en-US"/>
+              </w:rPr>
+              <w:t xml:space="preserve"> 2020 I have been studying English with a tutor and have increased my level from Eleme</w:t>
+            </w:r>
+            <w:r>
+              <w:rPr>
+                <w:b w:val="0"/>
+                <w:sz w:val="24"/>
+                <w:szCs w:val="24"/>
+                <w:lang w:val="en-US"/>
+              </w:rPr>
+              <w:t>ntary to Intermediate</w:t>
+            </w:r>
+            <w:r>
+              <w:rPr>
+                <w:b w:val="0"/>
+                <w:sz w:val="24"/>
+                <w:szCs w:val="24"/>
+                <w:lang w:val="en-US"/>
+              </w:rPr>
+              <w:t xml:space="preserve"> (</w:t>
+            </w:r>
+            <w:r>
+              <w:rPr>
+                <w:b w:val="0"/>
+                <w:sz w:val="24"/>
+                <w:szCs w:val="24"/>
+                <w:lang w:val="en-US"/>
+              </w:rPr>
+              <w:t>B1</w:t>
+            </w:r>
+            <w:r>
+              <w:rPr>
+                <w:b w:val="0"/>
+                <w:sz w:val="24"/>
+                <w:szCs w:val="24"/>
+                <w:lang w:val="en-US"/>
+              </w:rPr>
+              <w:t>)</w:t>
+            </w:r>
+            <w:r>
+              <w:rPr>
+                <w:b w:val="0"/>
+                <w:sz w:val="24"/>
+                <w:szCs w:val="24"/>
+                <w:lang w:val="en-US"/>
+              </w:rPr>
+              <w:t>.</w:t>
             </w:r>
           </w:p>
           <w:p>
@@ -748,9 +804,8 @@
                 <w:szCs w:val="24"/>
                 <w:lang w:val="en-US"/>
               </w:rPr>
-              <w:t xml:space="preserve">In 2013 graduated from </w:t>
-            </w:r>
-            <w:proofErr w:type="spellStart"/>
+              <w:t>Since March 2021</w:t>
+            </w:r>
             <w:r>
               <w:rPr>
                 <w:b w:val="0"/>
@@ -758,9 +813,8 @@
                 <w:szCs w:val="24"/>
                 <w:lang w:val="en-US"/>
               </w:rPr>
-              <w:t>KhNEU</w:t>
-            </w:r>
-            <w:proofErr w:type="spellEnd"/>
+              <w:t xml:space="preserve"> I have been working as a </w:t>
+            </w:r>
             <w:r>
               <w:rPr>
                 <w:b w:val="0"/>
@@ -768,7 +822,25 @@
                 <w:szCs w:val="24"/>
                 <w:lang w:val="en-US"/>
               </w:rPr>
-              <w:t xml:space="preserve"> with a degree in Administrative Management (“Master” level).</w:t>
+              <w:t>Front End</w:t>
+            </w:r>
+            <w:r>
+              <w:rPr>
+                <w:b w:val="0"/>
+                <w:sz w:val="24"/>
+                <w:szCs w:val="24"/>
+                <w:lang w:val="en-US"/>
+              </w:rPr>
+              <w:t>/Markup (HTML, CSS)</w:t>
+            </w:r>
+            <w:r>
+              <w:rPr>
+                <w:b w:val="0"/>
+                <w:sz w:val="24"/>
+                <w:szCs w:val="24"/>
+                <w:lang w:val="en-US"/>
+              </w:rPr>
+              <w:t xml:space="preserve"> developer in projects for the European and American markets.</w:t>
             </w:r>
           </w:p>
         </w:tc>
@@ -1052,36 +1124,6 @@
                 <w:lang w:val="en-US"/>
               </w:rPr>
             </w:pPr>
-          </w:p>
-          <w:p>
-            <w:pPr>
-              <w:jc w:val="both"/>
-              <w:rPr>
-                <w:b/>
-                <w:sz w:val="24"/>
-                <w:lang w:val="en-US"/>
-              </w:rPr>
-            </w:pPr>
-          </w:p>
-          <w:p>
-            <w:pPr>
-              <w:jc w:val="both"/>
-              <w:rPr>
-                <w:b/>
-                <w:sz w:val="24"/>
-                <w:lang w:val="en-US"/>
-              </w:rPr>
-            </w:pPr>
-          </w:p>
-          <w:p>
-            <w:pPr>
-              <w:jc w:val="both"/>
-              <w:rPr>
-                <w:b/>
-                <w:sz w:val="24"/>
-                <w:lang w:val="en-US"/>
-              </w:rPr>
-            </w:pPr>
             <w:r>
               <w:rPr>
                 <w:b/>
@@ -1622,6 +1664,8 @@
                 <w:lang w:val="en-US"/>
               </w:rPr>
             </w:pPr>
+            <w:bookmarkStart w:id="0" w:name="_GoBack"/>
+            <w:bookmarkEnd w:id="0"/>
           </w:p>
         </w:tc>
         <w:tc>
@@ -1731,14 +1775,7 @@
                 <w:sz w:val="24"/>
                 <w:lang w:val="en-US"/>
               </w:rPr>
-              <w:t>development of sections and pages of</w:t>
-            </w:r>
-            <w:r>
-              <w:rPr>
-                <w:sz w:val="24"/>
-                <w:lang w:val="en-US"/>
-              </w:rPr>
-              <w:t xml:space="preserve"> websites according to </w:t>
+              <w:t xml:space="preserve">development of sections and pages of websites according to </w:t>
             </w:r>
             <w:proofErr w:type="spellStart"/>
             <w:r>
@@ -1754,23 +1791,7 @@
                 <w:sz w:val="24"/>
                 <w:lang w:val="en-US"/>
               </w:rPr>
-              <w:t xml:space="preserve"> layouts (HTML, </w:t>
-            </w:r>
-            <w:r>
-              <w:rPr>
-                <w:sz w:val="24"/>
-                <w:lang w:val="en-US"/>
-              </w:rPr>
-              <w:t>CSS/</w:t>
-            </w:r>
-            <w:bookmarkStart w:id="0" w:name="_GoBack"/>
-            <w:bookmarkEnd w:id="0"/>
-            <w:r>
-              <w:rPr>
-                <w:sz w:val="24"/>
-                <w:lang w:val="en-US"/>
-              </w:rPr>
-              <w:t>SCSS, Tailwind, Bootstrap, jQuery, JavaScript);</w:t>
+              <w:t xml:space="preserve"> and Adobe XD layouts (HTML, SCSS, Tailwind, Bootstrap, jQuery, JavaScript);</w:t>
             </w:r>
           </w:p>
           <w:p>
@@ -1792,14 +1813,7 @@
                 <w:sz w:val="24"/>
                 <w:lang w:val="en-US"/>
               </w:rPr>
-              <w:t>optimization of accessibility of blocks and elements for users and screen readers</w:t>
-            </w:r>
-            <w:r>
-              <w:rPr>
-                <w:sz w:val="24"/>
-                <w:lang w:val="en-US"/>
-              </w:rPr>
-              <w:t>;</w:t>
+              <w:t>development of existing blocks, sections, components and pages of websites;</w:t>
             </w:r>
           </w:p>
           <w:p>
@@ -1821,7 +1835,7 @@
                 <w:sz w:val="24"/>
                 <w:lang w:val="en-US"/>
               </w:rPr>
-              <w:t>development of existing blocks, sections, components and pages of websites;</w:t>
+              <w:t>styling standard WordPress components according to layouts;</w:t>
             </w:r>
           </w:p>
           <w:p>
@@ -1838,28 +1852,6 @@
                 <w:lang w:val="en-US"/>
               </w:rPr>
             </w:pPr>
-            <w:r>
-              <w:rPr>
-                <w:sz w:val="24"/>
-                <w:lang w:val="en-US"/>
-              </w:rPr>
-              <w:t>styling standard WordPress components according to layouts;</w:t>
-            </w:r>
-          </w:p>
-          <w:p>
-            <w:pPr>
-              <w:pStyle w:val="a5"/>
-              <w:numPr>
-                <w:ilvl w:val="0"/>
-                <w:numId w:val="27"/>
-              </w:numPr>
-              <w:spacing w:before="120"/>
-              <w:ind w:hanging="720"/>
-              <w:rPr>
-                <w:sz w:val="24"/>
-                <w:lang w:val="en-US"/>
-              </w:rPr>
-            </w:pPr>
             <w:proofErr w:type="gramStart"/>
             <w:r>
               <w:rPr>
@@ -2122,7 +2114,6 @@
                 <w:sz w:val="24"/>
                 <w:lang w:val="en-US"/>
               </w:rPr>
-              <w:lastRenderedPageBreak/>
               <w:t>adding</w:t>
             </w:r>
             <w:proofErr w:type="gramEnd"/>
@@ -2197,7 +2188,15 @@
                 <w:sz w:val="24"/>
                 <w:lang w:val="en-US"/>
               </w:rPr>
-              <w:t xml:space="preserve">Got practical skills in page markup on real projects, page markup using BEM principles, mobile first, pixel perfect, </w:t>
+              <w:t xml:space="preserve">Got practical skills in page markup on real projects, page markup </w:t>
+            </w:r>
+            <w:r>
+              <w:rPr>
+                <w:sz w:val="24"/>
+                <w:lang w:val="en-US"/>
+              </w:rPr>
+              <w:lastRenderedPageBreak/>
+              <w:t xml:space="preserve">using BEM principles, mobile first, pixel perfect, </w:t>
             </w:r>
             <w:proofErr w:type="gramStart"/>
             <w:r>
@@ -3292,7 +3291,6 @@
           <w:szCs w:val="24"/>
           <w:lang w:val="en-US"/>
         </w:rPr>
-        <w:lastRenderedPageBreak/>
         <w:t xml:space="preserve">skills in working with the </w:t>
       </w:r>
       <w:proofErr w:type="spellStart"/>
@@ -3529,6 +3527,7 @@
           <w:szCs w:val="24"/>
           <w:lang w:val="en-US"/>
         </w:rPr>
+        <w:lastRenderedPageBreak/>
         <w:t>English - Intermediate (</w:t>
       </w:r>
       <w:r>
@@ -6984,7 +6983,7 @@
 </file>
 
 <file path=customXml/itemProps1.xml><?xml version="1.0" encoding="utf-8"?>
-<ds:datastoreItem xmlns:ds="http://schemas.openxmlformats.org/officeDocument/2006/customXml" ds:itemID="{53C44531-4555-44FC-8C8E-99EC336ED76E}">
+<ds:datastoreItem xmlns:ds="http://schemas.openxmlformats.org/officeDocument/2006/customXml" ds:itemID="{42F0C230-0D4F-42BE-AC99-D5761755754A}">
   <ds:schemaRefs>
     <ds:schemaRef ds:uri="http://schemas.openxmlformats.org/officeDocument/2006/bibliography"/>
   </ds:schemaRefs>

</xml_diff>

<commit_message>
content, cv were changed
</commit_message>
<xml_diff>
--- a/Kolotko_V_V-CV-en.docx
+++ b/Kolotko_V_V-CV-en.docx
@@ -56,7 +56,16 @@
           <w:szCs w:val="28"/>
           <w:lang w:val="en-US"/>
         </w:rPr>
-        <w:t>: 066</w:t>
+        <w:t>:</w:t>
+      </w:r>
+      <w:r>
+        <w:rPr>
+          <w:b/>
+          <w:sz w:val="28"/>
+          <w:szCs w:val="28"/>
+          <w:lang w:val="uk-UA"/>
+        </w:rPr>
+        <w:t xml:space="preserve"> +48 453 333 446</w:t>
       </w:r>
       <w:r>
         <w:rPr>
@@ -65,7 +74,7 @@
           <w:szCs w:val="28"/>
           <w:lang w:val="en-US"/>
         </w:rPr>
-        <w:t>-</w:t>
+        <w:t xml:space="preserve">; </w:t>
       </w:r>
       <w:r>
         <w:rPr>
@@ -74,7 +83,7 @@
           <w:szCs w:val="28"/>
           <w:lang w:val="en-US"/>
         </w:rPr>
-        <w:t>881-95-58</w:t>
+        <w:t>+38 098 </w:t>
       </w:r>
       <w:r>
         <w:rPr>
@@ -83,7 +92,7 @@
           <w:szCs w:val="28"/>
           <w:lang w:val="en-US"/>
         </w:rPr>
-        <w:t xml:space="preserve"> (Viber, Telegram)</w:t>
+        <w:t>856</w:t>
       </w:r>
       <w:r>
         <w:rPr>
@@ -92,7 +101,7 @@
           <w:szCs w:val="28"/>
           <w:lang w:val="en-US"/>
         </w:rPr>
-        <w:t xml:space="preserve">; </w:t>
+        <w:t xml:space="preserve"> </w:t>
       </w:r>
       <w:r>
         <w:rPr>
@@ -101,7 +110,97 @@
           <w:szCs w:val="28"/>
           <w:lang w:val="en-US"/>
         </w:rPr>
-        <w:t>098-856-25-45</w:t>
+        <w:t>25</w:t>
+      </w:r>
+      <w:r>
+        <w:rPr>
+          <w:b/>
+          <w:sz w:val="28"/>
+          <w:szCs w:val="28"/>
+          <w:lang w:val="en-US"/>
+        </w:rPr>
+        <w:t xml:space="preserve"> </w:t>
+      </w:r>
+      <w:r>
+        <w:rPr>
+          <w:b/>
+          <w:sz w:val="28"/>
+          <w:szCs w:val="28"/>
+          <w:lang w:val="en-US"/>
+        </w:rPr>
+        <w:t>45</w:t>
+      </w:r>
+      <w:r>
+        <w:rPr>
+          <w:b/>
+          <w:sz w:val="28"/>
+          <w:szCs w:val="28"/>
+          <w:lang w:val="en-US"/>
+        </w:rPr>
+        <w:t>; +38 </w:t>
+      </w:r>
+      <w:r>
+        <w:rPr>
+          <w:b/>
+          <w:sz w:val="28"/>
+          <w:szCs w:val="28"/>
+          <w:lang w:val="en-US"/>
+        </w:rPr>
+        <w:t>066</w:t>
+      </w:r>
+      <w:r>
+        <w:rPr>
+          <w:b/>
+          <w:sz w:val="28"/>
+          <w:szCs w:val="28"/>
+          <w:lang w:val="en-US"/>
+        </w:rPr>
+        <w:t> </w:t>
+      </w:r>
+      <w:r>
+        <w:rPr>
+          <w:b/>
+          <w:sz w:val="28"/>
+          <w:szCs w:val="28"/>
+          <w:lang w:val="en-US"/>
+        </w:rPr>
+        <w:t>881</w:t>
+      </w:r>
+      <w:r>
+        <w:rPr>
+          <w:b/>
+          <w:sz w:val="28"/>
+          <w:szCs w:val="28"/>
+          <w:lang w:val="en-US"/>
+        </w:rPr>
+        <w:t xml:space="preserve"> </w:t>
+      </w:r>
+      <w:r>
+        <w:rPr>
+          <w:b/>
+          <w:sz w:val="28"/>
+          <w:szCs w:val="28"/>
+          <w:lang w:val="en-US"/>
+        </w:rPr>
+        <w:t>95</w:t>
+      </w:r>
+      <w:r>
+        <w:rPr>
+          <w:b/>
+          <w:sz w:val="28"/>
+          <w:szCs w:val="28"/>
+          <w:lang w:val="en-US"/>
+        </w:rPr>
+        <w:t xml:space="preserve"> </w:t>
+      </w:r>
+      <w:r>
+        <w:rPr>
+          <w:b/>
+          <w:sz w:val="28"/>
+          <w:szCs w:val="28"/>
+          <w:lang w:val="en-US"/>
+        </w:rPr>
+        <w:t>58 (Viber, Telegram)</w:t>
       </w:r>
     </w:p>
     <w:p>
@@ -241,7 +340,6 @@
             <w:rStyle w:val="a9"/>
             <w:sz w:val="24"/>
             <w:szCs w:val="24"/>
-            <w:lang w:val="en-US"/>
           </w:rPr>
           <w:t>https</w:t>
         </w:r>
@@ -254,17 +352,14 @@
           </w:rPr>
           <w:t>://</w:t>
         </w:r>
-        <w:proofErr w:type="spellStart"/>
         <w:r>
           <w:rPr>
             <w:rStyle w:val="a9"/>
             <w:sz w:val="24"/>
             <w:szCs w:val="24"/>
-            <w:lang w:val="en-US"/>
           </w:rPr>
           <w:t>vladka</w:t>
         </w:r>
-        <w:proofErr w:type="spellEnd"/>
         <w:r>
           <w:rPr>
             <w:rStyle w:val="a9"/>
@@ -279,9 +374,59 @@
             <w:rStyle w:val="a9"/>
             <w:sz w:val="24"/>
             <w:szCs w:val="24"/>
-            <w:lang w:val="en-US"/>
           </w:rPr>
           <w:t>k</w:t>
+        </w:r>
+        <w:r>
+          <w:rPr>
+            <w:rStyle w:val="a9"/>
+            <w:sz w:val="24"/>
+            <w:szCs w:val="24"/>
+            <w:lang w:val="uk-UA"/>
+          </w:rPr>
+          <w:t>.</w:t>
+        </w:r>
+        <w:r>
+          <w:rPr>
+            <w:rStyle w:val="a9"/>
+            <w:sz w:val="24"/>
+            <w:szCs w:val="24"/>
+          </w:rPr>
+          <w:t>github</w:t>
+        </w:r>
+        <w:r>
+          <w:rPr>
+            <w:rStyle w:val="a9"/>
+            <w:sz w:val="24"/>
+            <w:szCs w:val="24"/>
+            <w:lang w:val="uk-UA"/>
+          </w:rPr>
+          <w:t>.</w:t>
+        </w:r>
+        <w:r>
+          <w:rPr>
+            <w:rStyle w:val="a9"/>
+            <w:sz w:val="24"/>
+            <w:szCs w:val="24"/>
+          </w:rPr>
+          <w:t>io</w:t>
+        </w:r>
+        <w:r>
+          <w:rPr>
+            <w:rStyle w:val="a9"/>
+            <w:sz w:val="24"/>
+            <w:szCs w:val="24"/>
+            <w:lang w:val="uk-UA"/>
+          </w:rPr>
+          <w:t>/</w:t>
+        </w:r>
+        <w:r>
+          <w:rPr>
+            <w:rStyle w:val="a9"/>
+            <w:sz w:val="24"/>
+            <w:szCs w:val="24"/>
+          </w:rPr>
+          <w:t>en</w:t>
         </w:r>
         <w:r>
           <w:rPr>
@@ -298,40 +443,10 @@
             <w:rStyle w:val="a9"/>
             <w:sz w:val="24"/>
             <w:szCs w:val="24"/>
-            <w:lang w:val="en-US"/>
           </w:rPr>
-          <w:t>github</w:t>
+          <w:t>html</w:t>
         </w:r>
         <w:proofErr w:type="spellEnd"/>
-        <w:r>
-          <w:rPr>
-            <w:rStyle w:val="a9"/>
-            <w:sz w:val="24"/>
-            <w:szCs w:val="24"/>
-            <w:lang w:val="uk-UA"/>
-          </w:rPr>
-          <w:t>.</w:t>
-        </w:r>
-        <w:proofErr w:type="spellStart"/>
-        <w:r>
-          <w:rPr>
-            <w:rStyle w:val="a9"/>
-            <w:sz w:val="24"/>
-            <w:szCs w:val="24"/>
-            <w:lang w:val="en-US"/>
-          </w:rPr>
-          <w:t>io</w:t>
-        </w:r>
-        <w:proofErr w:type="spellEnd"/>
-        <w:r>
-          <w:rPr>
-            <w:rStyle w:val="a9"/>
-            <w:sz w:val="24"/>
-            <w:szCs w:val="24"/>
-            <w:lang w:val="uk-UA"/>
-          </w:rPr>
-          <w:t>/</w:t>
-        </w:r>
       </w:hyperlink>
     </w:p>
     <w:tbl>
@@ -500,11 +615,61 @@
               <w:spacing w:before="120" w:after="120"/>
               <w:jc w:val="both"/>
               <w:rPr>
+                <w:b w:val="0"/>
                 <w:sz w:val="24"/>
                 <w:szCs w:val="24"/>
                 <w:lang w:val="en-US"/>
               </w:rPr>
             </w:pPr>
+            <w:r>
+              <w:rPr>
+                <w:b w:val="0"/>
+                <w:sz w:val="24"/>
+                <w:szCs w:val="24"/>
+                <w:lang w:val="en-US"/>
+              </w:rPr>
+              <w:t xml:space="preserve">Since March 2021, I have been working as a Front End/Markup (HTML, CSS) developer on projects for the European and American markets, focusing on creating </w:t>
+            </w:r>
+            <w:proofErr w:type="gramStart"/>
+            <w:r>
+              <w:rPr>
+                <w:b w:val="0"/>
+                <w:sz w:val="24"/>
+                <w:szCs w:val="24"/>
+                <w:lang w:val="en-US"/>
+              </w:rPr>
+              <w:t>responsive,</w:t>
+            </w:r>
+            <w:proofErr w:type="gramEnd"/>
+            <w:r>
+              <w:rPr>
+                <w:b w:val="0"/>
+                <w:sz w:val="24"/>
+                <w:szCs w:val="24"/>
+                <w:lang w:val="en-US"/>
+              </w:rPr>
+              <w:t xml:space="preserve"> and visually appealing web interfaces. My work includes developing sections and pages of websites based on </w:t>
+            </w:r>
+            <w:proofErr w:type="spellStart"/>
+            <w:r>
+              <w:rPr>
+                <w:b w:val="0"/>
+                <w:sz w:val="24"/>
+                <w:szCs w:val="24"/>
+                <w:lang w:val="en-US"/>
+              </w:rPr>
+              <w:t>Figma</w:t>
+            </w:r>
+            <w:proofErr w:type="spellEnd"/>
+            <w:r>
+              <w:rPr>
+                <w:b w:val="0"/>
+                <w:sz w:val="24"/>
+                <w:szCs w:val="24"/>
+                <w:lang w:val="en-US"/>
+              </w:rPr>
+              <w:t xml:space="preserve"> layouts, utilizing technologies such as HTML, SCSS, Tailwind, jQuery, and JavaScript to ensure precision and seamless functionality. I am involved in web projects by developing and refining existing blocks, sections, components, and pages. In addition, I am involved in styling standard WordPress components according to design specifications, maintaining uniformity across the websites.</w:t>
+            </w:r>
           </w:p>
           <w:p>
             <w:pPr>
@@ -518,6 +683,7 @@
                 <w:lang w:val="en-US"/>
               </w:rPr>
             </w:pPr>
+            <w:proofErr w:type="gramStart"/>
             <w:r>
               <w:rPr>
                 <w:b w:val="0"/>
@@ -525,73 +691,9 @@
                 <w:szCs w:val="24"/>
                 <w:lang w:val="en-US"/>
               </w:rPr>
-              <w:t xml:space="preserve">In 2013 </w:t>
-            </w:r>
-            <w:r>
-              <w:rPr>
-                <w:b w:val="0"/>
-                <w:sz w:val="24"/>
-                <w:szCs w:val="24"/>
-                <w:lang w:val="en-US"/>
-              </w:rPr>
-              <w:t xml:space="preserve">graduated from </w:t>
-            </w:r>
-            <w:proofErr w:type="spellStart"/>
-            <w:r>
-              <w:rPr>
-                <w:b w:val="0"/>
-                <w:sz w:val="24"/>
-                <w:szCs w:val="24"/>
-                <w:lang w:val="en-US"/>
-              </w:rPr>
-              <w:t>K</w:t>
-            </w:r>
-            <w:r>
-              <w:rPr>
-                <w:b w:val="0"/>
-                <w:sz w:val="24"/>
-                <w:szCs w:val="24"/>
-                <w:lang w:val="en-US"/>
-              </w:rPr>
-              <w:t>h</w:t>
-            </w:r>
-            <w:r>
-              <w:rPr>
-                <w:b w:val="0"/>
-                <w:sz w:val="24"/>
-                <w:szCs w:val="24"/>
-                <w:lang w:val="en-US"/>
-              </w:rPr>
-              <w:t>NEU</w:t>
-            </w:r>
-            <w:proofErr w:type="spellEnd"/>
-            <w:r>
-              <w:rPr>
-                <w:b w:val="0"/>
-                <w:sz w:val="24"/>
-                <w:szCs w:val="24"/>
-                <w:lang w:val="en-US"/>
-              </w:rPr>
-              <w:t xml:space="preserve"> </w:t>
-            </w:r>
-            <w:r>
-              <w:rPr>
-                <w:b w:val="0"/>
-                <w:sz w:val="24"/>
-                <w:szCs w:val="24"/>
-                <w:lang w:val="en-US"/>
-              </w:rPr>
-              <w:t>with a degree in Administrati</w:t>
-            </w:r>
-            <w:r>
-              <w:rPr>
-                <w:b w:val="0"/>
-                <w:sz w:val="24"/>
-                <w:szCs w:val="24"/>
-                <w:lang w:val="en-US"/>
-              </w:rPr>
-              <w:t>ve Management (“Master” level).</w:t>
-            </w:r>
+              <w:t>In 2020, completed two courses at Source IT: Markup Development (HTML + CSS) and Front End Development.</w:t>
+            </w:r>
+            <w:proofErr w:type="gramEnd"/>
           </w:p>
           <w:p>
             <w:pPr>
@@ -605,7 +707,6 @@
                 <w:lang w:val="en-US"/>
               </w:rPr>
             </w:pPr>
-            <w:proofErr w:type="gramStart"/>
             <w:r>
               <w:rPr>
                 <w:b w:val="0"/>
@@ -613,9 +714,8 @@
                 <w:szCs w:val="24"/>
                 <w:lang w:val="en-US"/>
               </w:rPr>
-              <w:t>In 2020, completed two courses at Source IT: Markup Development (HTML + CSS) and Front End Development.</w:t>
-            </w:r>
-            <w:proofErr w:type="gramEnd"/>
+              <w:t>Since 2018 I worked as SEO specialist in the internet marketing agency. I started as SEO assistant with minimal knowledge and no experience in this field.</w:t>
+            </w:r>
           </w:p>
           <w:p>
             <w:pPr>
@@ -636,8 +736,9 @@
                 <w:szCs w:val="24"/>
                 <w:lang w:val="en-US"/>
               </w:rPr>
-              <w:t>Sinc</w:t>
-            </w:r>
+              <w:t xml:space="preserve">In 2013 graduated from </w:t>
+            </w:r>
+            <w:proofErr w:type="spellStart"/>
             <w:r>
               <w:rPr>
                 <w:b w:val="0"/>
@@ -645,8 +746,9 @@
                 <w:szCs w:val="24"/>
                 <w:lang w:val="en-US"/>
               </w:rPr>
-              <w:t>e 2018 I work</w:t>
-            </w:r>
+              <w:t>KhNEU</w:t>
+            </w:r>
+            <w:proofErr w:type="spellEnd"/>
             <w:r>
               <w:rPr>
                 <w:b w:val="0"/>
@@ -654,193 +756,7 @@
                 <w:szCs w:val="24"/>
                 <w:lang w:val="en-US"/>
               </w:rPr>
-              <w:t>ed</w:t>
-            </w:r>
-            <w:r>
-              <w:rPr>
-                <w:b w:val="0"/>
-                <w:sz w:val="24"/>
-                <w:szCs w:val="24"/>
-                <w:lang w:val="en-US"/>
-              </w:rPr>
-              <w:t xml:space="preserve"> as</w:t>
-            </w:r>
-            <w:r>
-              <w:rPr>
-                <w:b w:val="0"/>
-                <w:sz w:val="24"/>
-                <w:szCs w:val="24"/>
-                <w:lang w:val="en-US"/>
-              </w:rPr>
-              <w:t xml:space="preserve"> SEO specialist in </w:t>
-            </w:r>
-            <w:r>
-              <w:rPr>
-                <w:b w:val="0"/>
-                <w:sz w:val="24"/>
-                <w:szCs w:val="24"/>
-                <w:lang w:val="en-US"/>
-              </w:rPr>
-              <w:t>the</w:t>
-            </w:r>
-            <w:r>
-              <w:rPr>
-                <w:b w:val="0"/>
-                <w:sz w:val="24"/>
-                <w:szCs w:val="24"/>
-                <w:lang w:val="en-US"/>
-              </w:rPr>
-              <w:t xml:space="preserve"> internet marketing agency. I started as SEO assistant with minimal knowledge and no experience in this field. Constant learning and work on </w:t>
-            </w:r>
-            <w:proofErr w:type="gramStart"/>
-            <w:r>
-              <w:rPr>
-                <w:b w:val="0"/>
-                <w:sz w:val="24"/>
-                <w:szCs w:val="24"/>
-                <w:lang w:val="en-US"/>
-              </w:rPr>
-              <w:t>myself</w:t>
-            </w:r>
-            <w:proofErr w:type="gramEnd"/>
-            <w:r>
-              <w:rPr>
-                <w:b w:val="0"/>
-                <w:sz w:val="24"/>
-                <w:szCs w:val="24"/>
-                <w:lang w:val="en-US"/>
-              </w:rPr>
-              <w:t xml:space="preserve"> have already become a habit and have allowed me to grow to a full-fledged sp</w:t>
-            </w:r>
-            <w:r>
-              <w:rPr>
-                <w:b w:val="0"/>
-                <w:sz w:val="24"/>
-                <w:szCs w:val="24"/>
-                <w:lang w:val="en-US"/>
-              </w:rPr>
-              <w:t xml:space="preserve">ecialist. In addition, since </w:t>
-            </w:r>
-            <w:r>
-              <w:rPr>
-                <w:b w:val="0"/>
-                <w:sz w:val="24"/>
-                <w:szCs w:val="24"/>
-                <w:lang w:val="en-US"/>
-              </w:rPr>
-              <w:t>year</w:t>
-            </w:r>
-            <w:r>
-              <w:rPr>
-                <w:b w:val="0"/>
-                <w:sz w:val="24"/>
-                <w:szCs w:val="24"/>
-                <w:lang w:val="en-US"/>
-              </w:rPr>
-              <w:t xml:space="preserve"> 2020 I have been studying English with a tutor and have increased my level from Eleme</w:t>
-            </w:r>
-            <w:r>
-              <w:rPr>
-                <w:b w:val="0"/>
-                <w:sz w:val="24"/>
-                <w:szCs w:val="24"/>
-                <w:lang w:val="en-US"/>
-              </w:rPr>
-              <w:t>ntary to Intermediate</w:t>
-            </w:r>
-            <w:r>
-              <w:rPr>
-                <w:b w:val="0"/>
-                <w:sz w:val="24"/>
-                <w:szCs w:val="24"/>
-                <w:lang w:val="en-US"/>
-              </w:rPr>
-              <w:t xml:space="preserve"> (</w:t>
-            </w:r>
-            <w:r>
-              <w:rPr>
-                <w:b w:val="0"/>
-                <w:sz w:val="24"/>
-                <w:szCs w:val="24"/>
-                <w:lang w:val="en-US"/>
-              </w:rPr>
-              <w:t>B1</w:t>
-            </w:r>
-            <w:r>
-              <w:rPr>
-                <w:b w:val="0"/>
-                <w:sz w:val="24"/>
-                <w:szCs w:val="24"/>
-                <w:lang w:val="en-US"/>
-              </w:rPr>
-              <w:t>)</w:t>
-            </w:r>
-            <w:r>
-              <w:rPr>
-                <w:b w:val="0"/>
-                <w:sz w:val="24"/>
-                <w:szCs w:val="24"/>
-                <w:lang w:val="en-US"/>
-              </w:rPr>
-              <w:t>.</w:t>
-            </w:r>
-          </w:p>
-          <w:p>
-            <w:pPr>
-              <w:pStyle w:val="a3"/>
-              <w:spacing w:before="120" w:after="120"/>
-              <w:jc w:val="both"/>
-              <w:rPr>
-                <w:b w:val="0"/>
-                <w:sz w:val="24"/>
-                <w:szCs w:val="24"/>
-                <w:lang w:val="en-US"/>
-              </w:rPr>
-            </w:pPr>
-            <w:r>
-              <w:rPr>
-                <w:b w:val="0"/>
-                <w:sz w:val="24"/>
-                <w:szCs w:val="24"/>
-                <w:lang w:val="en-US"/>
-              </w:rPr>
-              <w:t>Since March 2021</w:t>
-            </w:r>
-            <w:r>
-              <w:rPr>
-                <w:b w:val="0"/>
-                <w:sz w:val="24"/>
-                <w:szCs w:val="24"/>
-                <w:lang w:val="en-US"/>
-              </w:rPr>
-              <w:t xml:space="preserve"> I have been working as a </w:t>
-            </w:r>
-            <w:r>
-              <w:rPr>
-                <w:b w:val="0"/>
-                <w:sz w:val="24"/>
-                <w:szCs w:val="24"/>
-                <w:lang w:val="en-US"/>
-              </w:rPr>
-              <w:t>Front End</w:t>
-            </w:r>
-            <w:r>
-              <w:rPr>
-                <w:b w:val="0"/>
-                <w:sz w:val="24"/>
-                <w:szCs w:val="24"/>
-                <w:lang w:val="en-US"/>
-              </w:rPr>
-              <w:t>/Markup (HTML, CSS)</w:t>
-            </w:r>
-            <w:r>
-              <w:rPr>
-                <w:b w:val="0"/>
-                <w:sz w:val="24"/>
-                <w:szCs w:val="24"/>
-                <w:lang w:val="en-US"/>
-              </w:rPr>
-              <w:t xml:space="preserve"> developer in projects for the European and American markets.</w:t>
+              <w:t xml:space="preserve"> with a degree in Administrative Management (“Master” level).</w:t>
             </w:r>
           </w:p>
         </w:tc>
@@ -1124,6 +1040,46 @@
                 <w:lang w:val="en-US"/>
               </w:rPr>
             </w:pPr>
+          </w:p>
+          <w:p>
+            <w:pPr>
+              <w:jc w:val="both"/>
+              <w:rPr>
+                <w:b/>
+                <w:sz w:val="24"/>
+                <w:lang w:val="en-US"/>
+              </w:rPr>
+            </w:pPr>
+          </w:p>
+          <w:p>
+            <w:pPr>
+              <w:jc w:val="both"/>
+              <w:rPr>
+                <w:b/>
+                <w:sz w:val="24"/>
+                <w:lang w:val="en-US"/>
+              </w:rPr>
+            </w:pPr>
+          </w:p>
+          <w:p>
+            <w:pPr>
+              <w:jc w:val="both"/>
+              <w:rPr>
+                <w:b/>
+                <w:sz w:val="24"/>
+                <w:lang w:val="en-US"/>
+              </w:rPr>
+            </w:pPr>
+          </w:p>
+          <w:p>
+            <w:pPr>
+              <w:jc w:val="both"/>
+              <w:rPr>
+                <w:b/>
+                <w:sz w:val="24"/>
+                <w:lang w:val="en-US"/>
+              </w:rPr>
+            </w:pPr>
             <w:r>
               <w:rPr>
                 <w:b/>
@@ -1664,8 +1620,6 @@
                 <w:lang w:val="en-US"/>
               </w:rPr>
             </w:pPr>
-            <w:bookmarkStart w:id="0" w:name="_GoBack"/>
-            <w:bookmarkEnd w:id="0"/>
           </w:p>
         </w:tc>
         <w:tc>
@@ -1775,7 +1729,14 @@
                 <w:sz w:val="24"/>
                 <w:lang w:val="en-US"/>
               </w:rPr>
-              <w:t xml:space="preserve">development of sections and pages of websites according to </w:t>
+              <w:t>development of sections and pages of</w:t>
+            </w:r>
+            <w:r>
+              <w:rPr>
+                <w:sz w:val="24"/>
+                <w:lang w:val="en-US"/>
+              </w:rPr>
+              <w:t xml:space="preserve"> websites according to </w:t>
             </w:r>
             <w:proofErr w:type="spellStart"/>
             <w:r>
@@ -1791,7 +1752,21 @@
                 <w:sz w:val="24"/>
                 <w:lang w:val="en-US"/>
               </w:rPr>
-              <w:t xml:space="preserve"> and Adobe XD layouts (HTML, SCSS, Tailwind, Bootstrap, jQuery, JavaScript);</w:t>
+              <w:t xml:space="preserve"> layouts (HTML, </w:t>
+            </w:r>
+            <w:r>
+              <w:rPr>
+                <w:sz w:val="24"/>
+                <w:lang w:val="en-US"/>
+              </w:rPr>
+              <w:t>CSS/</w:t>
+            </w:r>
+            <w:r>
+              <w:rPr>
+                <w:sz w:val="24"/>
+                <w:lang w:val="en-US"/>
+              </w:rPr>
+              <w:t>SCSS, Tailwind, Bootstrap, jQuery, JavaScript);</w:t>
             </w:r>
           </w:p>
           <w:p>
@@ -1813,7 +1788,14 @@
                 <w:sz w:val="24"/>
                 <w:lang w:val="en-US"/>
               </w:rPr>
-              <w:t>development of existing blocks, sections, components and pages of websites;</w:t>
+              <w:t>optimization of accessibility of blocks and elements for users and screen readers</w:t>
+            </w:r>
+            <w:r>
+              <w:rPr>
+                <w:sz w:val="24"/>
+                <w:lang w:val="en-US"/>
+              </w:rPr>
+              <w:t>;</w:t>
             </w:r>
           </w:p>
           <w:p>
@@ -1835,7 +1817,7 @@
                 <w:sz w:val="24"/>
                 <w:lang w:val="en-US"/>
               </w:rPr>
-              <w:t>styling standard WordPress components according to layouts;</w:t>
+              <w:t>development of existing blocks, sections, components and pages of websites;</w:t>
             </w:r>
           </w:p>
           <w:p>
@@ -1852,13 +1834,35 @@
                 <w:lang w:val="en-US"/>
               </w:rPr>
             </w:pPr>
+            <w:r>
+              <w:rPr>
+                <w:sz w:val="24"/>
+                <w:lang w:val="en-US"/>
+              </w:rPr>
+              <w:t>styling standard WordPress components according to layouts;</w:t>
+            </w:r>
+          </w:p>
+          <w:p>
+            <w:pPr>
+              <w:pStyle w:val="a5"/>
+              <w:numPr>
+                <w:ilvl w:val="0"/>
+                <w:numId w:val="27"/>
+              </w:numPr>
+              <w:spacing w:before="120"/>
+              <w:ind w:left="743" w:hanging="754"/>
+              <w:rPr>
+                <w:sz w:val="24"/>
+                <w:lang w:val="en-US"/>
+              </w:rPr>
+            </w:pPr>
             <w:proofErr w:type="gramStart"/>
             <w:r>
               <w:rPr>
                 <w:sz w:val="24"/>
                 <w:lang w:val="en-US"/>
               </w:rPr>
-              <w:t>fixing</w:t>
+              <w:t>validation</w:t>
             </w:r>
             <w:proofErr w:type="gramEnd"/>
             <w:r>
@@ -1866,21 +1870,21 @@
                 <w:sz w:val="24"/>
                 <w:lang w:val="en-US"/>
               </w:rPr>
-              <w:t xml:space="preserve"> bugs </w:t>
-            </w:r>
-            <w:r>
-              <w:rPr>
-                <w:sz w:val="24"/>
-                <w:lang w:val="en-US"/>
-              </w:rPr>
-              <w:t>and inconsistencies between web</w:t>
-            </w:r>
-            <w:r>
-              <w:rPr>
-                <w:sz w:val="24"/>
-                <w:lang w:val="en-US"/>
-              </w:rPr>
-              <w:t>site pages and layout.</w:t>
+              <w:t xml:space="preserve"> of page</w:t>
+            </w:r>
+            <w:r>
+              <w:rPr>
+                <w:sz w:val="24"/>
+                <w:lang w:val="en-US"/>
+              </w:rPr>
+              <w:t xml:space="preserve">s and components against design </w:t>
+            </w:r>
+            <w:r>
+              <w:rPr>
+                <w:sz w:val="24"/>
+                <w:lang w:val="en-US"/>
+              </w:rPr>
+              <w:t>specifications, functional requirements, and cross-browser compatibility.</w:t>
             </w:r>
           </w:p>
           <w:p>
@@ -2114,6 +2118,7 @@
                 <w:sz w:val="24"/>
                 <w:lang w:val="en-US"/>
               </w:rPr>
+              <w:lastRenderedPageBreak/>
               <w:t>adding</w:t>
             </w:r>
             <w:proofErr w:type="gramEnd"/>
@@ -2188,15 +2193,7 @@
                 <w:sz w:val="24"/>
                 <w:lang w:val="en-US"/>
               </w:rPr>
-              <w:t xml:space="preserve">Got practical skills in page markup on real projects, page markup </w:t>
-            </w:r>
-            <w:r>
-              <w:rPr>
-                <w:sz w:val="24"/>
-                <w:lang w:val="en-US"/>
-              </w:rPr>
-              <w:lastRenderedPageBreak/>
-              <w:t xml:space="preserve">using BEM principles, mobile first, pixel perfect, </w:t>
+              <w:t xml:space="preserve">Got practical skills in page markup on real projects, page markup using BEM principles, mobile first, pixel perfect, </w:t>
             </w:r>
             <w:proofErr w:type="gramStart"/>
             <w:r>
@@ -2998,13 +2995,6 @@
               </w:rPr>
               <w:t>Received the educational qualification level «Master»</w:t>
             </w:r>
-            <w:r>
-              <w:rPr>
-                <w:sz w:val="24"/>
-                <w:lang w:val="en-US"/>
-              </w:rPr>
-              <w:t xml:space="preserve"> </w:t>
-            </w:r>
           </w:p>
         </w:tc>
       </w:tr>
@@ -3079,6 +3069,34 @@
         <w:shd w:val="clear" w:color="auto" w:fill="FFFFFF"/>
         <w:spacing w:before="0" w:after="88"/>
         <w:rPr>
+          <w:rFonts w:ascii="Times New Roman" w:hAnsi="Times New Roman"/>
+          <w:b/>
+          <w:bCs/>
+          <w:color w:val="0F0F0F"/>
+          <w:lang w:val="en-US"/>
+        </w:rPr>
+      </w:pPr>
+    </w:p>
+    <w:p>
+      <w:pPr>
+        <w:pStyle w:val="3"/>
+        <w:shd w:val="clear" w:color="auto" w:fill="FFFFFF"/>
+        <w:spacing w:before="0" w:after="88"/>
+        <w:rPr>
+          <w:rFonts w:ascii="Times New Roman" w:hAnsi="Times New Roman"/>
+          <w:b/>
+          <w:bCs/>
+          <w:color w:val="0F0F0F"/>
+          <w:lang w:val="uk-UA"/>
+        </w:rPr>
+      </w:pPr>
+    </w:p>
+    <w:p>
+      <w:pPr>
+        <w:pStyle w:val="3"/>
+        <w:shd w:val="clear" w:color="auto" w:fill="FFFFFF"/>
+        <w:spacing w:before="0" w:after="88"/>
+        <w:rPr>
           <w:rFonts w:ascii="Arial" w:hAnsi="Arial" w:cs="Arial"/>
           <w:b/>
           <w:bCs/>
@@ -3088,6 +3106,8 @@
           <w:lang w:val="en-US"/>
         </w:rPr>
       </w:pPr>
+      <w:bookmarkStart w:id="0" w:name="_GoBack"/>
+      <w:bookmarkEnd w:id="0"/>
       <w:r>
         <w:rPr>
           <w:rFonts w:ascii="Times New Roman" w:hAnsi="Times New Roman"/>
@@ -3172,6 +3192,15 @@
       <w:pPr>
         <w:spacing w:after="120"/>
         <w:rPr>
+          <w:sz w:val="24"/>
+          <w:lang w:val="en-US"/>
+        </w:rPr>
+      </w:pPr>
+    </w:p>
+    <w:p>
+      <w:pPr>
+        <w:spacing w:after="120"/>
+        <w:rPr>
           <w:b/>
           <w:sz w:val="24"/>
           <w:lang w:val="en-US"/>
@@ -3183,253 +3212,118 @@
           <w:sz w:val="24"/>
           <w:lang w:val="en-US"/>
         </w:rPr>
-        <w:t>SKILLS</w:t>
-      </w:r>
-      <w:r>
-        <w:rPr>
-          <w:b/>
-          <w:sz w:val="24"/>
-          <w:lang w:val="en-US"/>
-        </w:rPr>
-        <w:t>:</w:t>
+        <w:lastRenderedPageBreak/>
+        <w:t>TECHNICAL SKILLS</w:t>
       </w:r>
     </w:p>
     <w:p>
       <w:pPr>
-        <w:numPr>
-          <w:ilvl w:val="0"/>
-          <w:numId w:val="23"/>
-        </w:numPr>
-        <w:jc w:val="both"/>
+        <w:spacing w:after="120"/>
         <w:rPr>
           <w:sz w:val="24"/>
-          <w:szCs w:val="24"/>
           <w:lang w:val="en-US"/>
         </w:rPr>
       </w:pPr>
       <w:r>
         <w:rPr>
           <w:sz w:val="24"/>
-          <w:szCs w:val="24"/>
           <w:lang w:val="en-US"/>
         </w:rPr>
-        <w:t>skills in working with HTML5 and CSS3;</w:t>
+        <w:t>Markup: HTML5, CSS3, SCSS</w:t>
       </w:r>
     </w:p>
     <w:p>
       <w:pPr>
-        <w:numPr>
-          <w:ilvl w:val="0"/>
-          <w:numId w:val="23"/>
-        </w:numPr>
-        <w:jc w:val="both"/>
+        <w:spacing w:after="120"/>
         <w:rPr>
           <w:sz w:val="24"/>
-          <w:szCs w:val="24"/>
           <w:lang w:val="en-US"/>
         </w:rPr>
       </w:pPr>
       <w:r>
         <w:rPr>
           <w:sz w:val="24"/>
-          <w:szCs w:val="24"/>
           <w:lang w:val="en-US"/>
         </w:rPr>
-        <w:t xml:space="preserve">skills of working with </w:t>
+        <w:t>JavaScript: JavaScript, jQuery</w:t>
+      </w:r>
+    </w:p>
+    <w:p>
+      <w:pPr>
+        <w:spacing w:after="120"/>
+        <w:rPr>
+          <w:sz w:val="24"/>
+          <w:lang w:val="en-US"/>
+        </w:rPr>
+      </w:pPr>
+      <w:r>
+        <w:rPr>
+          <w:sz w:val="24"/>
+          <w:lang w:val="en-US"/>
+        </w:rPr>
+        <w:t>CSS Frameworks: Tailwind CSS, Bootstrap</w:t>
+      </w:r>
+    </w:p>
+    <w:p>
+      <w:pPr>
+        <w:spacing w:after="120"/>
+        <w:rPr>
+          <w:sz w:val="24"/>
+          <w:lang w:val="en-US"/>
+        </w:rPr>
+      </w:pPr>
+      <w:r>
+        <w:rPr>
+          <w:sz w:val="24"/>
+          <w:lang w:val="en-US"/>
+        </w:rPr>
+        <w:t>CMS: WordPress</w:t>
+      </w:r>
+    </w:p>
+    <w:p>
+      <w:pPr>
+        <w:spacing w:after="120"/>
+        <w:rPr>
+          <w:sz w:val="24"/>
+          <w:lang w:val="en-US"/>
+        </w:rPr>
+      </w:pPr>
+      <w:r>
+        <w:rPr>
+          <w:sz w:val="24"/>
+          <w:lang w:val="en-US"/>
+        </w:rPr>
+        <w:t xml:space="preserve">Version Control: </w:t>
       </w:r>
       <w:proofErr w:type="spellStart"/>
       <w:r>
         <w:rPr>
           <w:sz w:val="24"/>
-          <w:szCs w:val="24"/>
           <w:lang w:val="en-US"/>
         </w:rPr>
-        <w:t>Prepros</w:t>
+        <w:t>Git</w:t>
       </w:r>
       <w:proofErr w:type="spellEnd"/>
-      <w:r>
-        <w:rPr>
-          <w:sz w:val="24"/>
-          <w:szCs w:val="24"/>
-          <w:lang w:val="en-US"/>
-        </w:rPr>
-        <w:t xml:space="preserve"> S</w:t>
-      </w:r>
-      <w:r>
-        <w:rPr>
-          <w:sz w:val="24"/>
-          <w:szCs w:val="24"/>
-          <w:lang w:val="en-US"/>
-        </w:rPr>
-        <w:t>C</w:t>
-      </w:r>
-      <w:r>
-        <w:rPr>
-          <w:sz w:val="24"/>
-          <w:szCs w:val="24"/>
-          <w:lang w:val="en-US"/>
-        </w:rPr>
-        <w:t>SS;</w:t>
-      </w:r>
     </w:p>
     <w:p>
       <w:pPr>
-        <w:numPr>
-          <w:ilvl w:val="0"/>
-          <w:numId w:val="23"/>
-        </w:numPr>
-        <w:jc w:val="both"/>
+        <w:spacing w:after="120"/>
         <w:rPr>
           <w:sz w:val="24"/>
-          <w:szCs w:val="24"/>
           <w:lang w:val="en-US"/>
         </w:rPr>
       </w:pPr>
       <w:r>
         <w:rPr>
           <w:sz w:val="24"/>
-          <w:szCs w:val="24"/>
           <w:lang w:val="en-US"/>
         </w:rPr>
-        <w:t xml:space="preserve">skills in working with the </w:t>
+        <w:t xml:space="preserve">Design Tools: </w:t>
       </w:r>
       <w:proofErr w:type="spellStart"/>
       <w:r>
         <w:rPr>
           <w:sz w:val="24"/>
-          <w:szCs w:val="24"/>
-          <w:lang w:val="en-US"/>
-        </w:rPr>
-        <w:t>Git</w:t>
-      </w:r>
-      <w:proofErr w:type="spellEnd"/>
-      <w:r>
-        <w:rPr>
-          <w:sz w:val="24"/>
-          <w:szCs w:val="24"/>
-          <w:lang w:val="en-US"/>
-        </w:rPr>
-        <w:t xml:space="preserve"> version control system;</w:t>
-      </w:r>
-    </w:p>
-    <w:p>
-      <w:pPr>
-        <w:numPr>
-          <w:ilvl w:val="0"/>
-          <w:numId w:val="23"/>
-        </w:numPr>
-        <w:jc w:val="both"/>
-        <w:rPr>
-          <w:sz w:val="24"/>
-          <w:szCs w:val="24"/>
-          <w:lang w:val="en-US"/>
-        </w:rPr>
-      </w:pPr>
-      <w:r>
-        <w:rPr>
-          <w:sz w:val="24"/>
-          <w:szCs w:val="24"/>
-          <w:lang w:val="en-US"/>
-        </w:rPr>
-        <w:t>skills in working with the Bootstrap</w:t>
-      </w:r>
-      <w:r>
-        <w:rPr>
-          <w:sz w:val="24"/>
-          <w:szCs w:val="24"/>
-          <w:lang w:val="en-US"/>
-        </w:rPr>
-        <w:t>, Tailwind</w:t>
-      </w:r>
-      <w:r>
-        <w:rPr>
-          <w:sz w:val="24"/>
-          <w:szCs w:val="24"/>
-          <w:lang w:val="en-US"/>
-        </w:rPr>
-        <w:t xml:space="preserve"> framework</w:t>
-      </w:r>
-      <w:r>
-        <w:rPr>
-          <w:sz w:val="24"/>
-          <w:szCs w:val="24"/>
-          <w:lang w:val="en-US"/>
-        </w:rPr>
-        <w:t>s</w:t>
-      </w:r>
-      <w:r>
-        <w:rPr>
-          <w:sz w:val="24"/>
-          <w:szCs w:val="24"/>
-          <w:lang w:val="en-US"/>
-        </w:rPr>
-        <w:t>;</w:t>
-      </w:r>
-    </w:p>
-    <w:p>
-      <w:pPr>
-        <w:numPr>
-          <w:ilvl w:val="0"/>
-          <w:numId w:val="23"/>
-        </w:numPr>
-        <w:jc w:val="both"/>
-        <w:rPr>
-          <w:sz w:val="24"/>
-          <w:szCs w:val="24"/>
-          <w:lang w:val="en-US"/>
-        </w:rPr>
-      </w:pPr>
-      <w:r>
-        <w:rPr>
-          <w:sz w:val="24"/>
-          <w:szCs w:val="24"/>
-          <w:lang w:val="en-US"/>
-        </w:rPr>
-        <w:t>knowledge and skills of working with JS</w:t>
-      </w:r>
-      <w:r>
-        <w:rPr>
-          <w:sz w:val="24"/>
-          <w:szCs w:val="24"/>
-          <w:lang w:val="en-US"/>
-        </w:rPr>
-        <w:t>, jQuery</w:t>
-      </w:r>
-      <w:r>
-        <w:rPr>
-          <w:sz w:val="24"/>
-          <w:szCs w:val="24"/>
-          <w:lang w:val="en-US"/>
-        </w:rPr>
-        <w:t>;</w:t>
-      </w:r>
-    </w:p>
-    <w:p>
-      <w:pPr>
-        <w:numPr>
-          <w:ilvl w:val="0"/>
-          <w:numId w:val="23"/>
-        </w:numPr>
-        <w:jc w:val="both"/>
-        <w:rPr>
-          <w:sz w:val="24"/>
-          <w:szCs w:val="24"/>
-          <w:lang w:val="en-US"/>
-        </w:rPr>
-      </w:pPr>
-      <w:r>
-        <w:rPr>
-          <w:sz w:val="24"/>
-          <w:szCs w:val="24"/>
-          <w:lang w:val="en-US"/>
-        </w:rPr>
-        <w:t xml:space="preserve">skills in </w:t>
-      </w:r>
-      <w:proofErr w:type="spellStart"/>
-      <w:r>
-        <w:rPr>
-          <w:sz w:val="24"/>
-          <w:szCs w:val="24"/>
           <w:lang w:val="en-US"/>
         </w:rPr>
         <w:t>Figma</w:t>
@@ -3438,113 +3332,79 @@
       <w:r>
         <w:rPr>
           <w:sz w:val="24"/>
-          <w:szCs w:val="24"/>
           <w:lang w:val="en-US"/>
         </w:rPr>
-        <w:t xml:space="preserve">, </w:t>
+        <w:t xml:space="preserve">, Adobe Photoshop, </w:t>
       </w:r>
       <w:proofErr w:type="spellStart"/>
       <w:r>
         <w:rPr>
           <w:sz w:val="24"/>
-          <w:szCs w:val="24"/>
           <w:lang w:val="en-US"/>
         </w:rPr>
         <w:t>Avocode</w:t>
       </w:r>
       <w:proofErr w:type="spellEnd"/>
+    </w:p>
+    <w:p>
+      <w:pPr>
+        <w:spacing w:after="120"/>
+        <w:rPr>
+          <w:b/>
+          <w:sz w:val="24"/>
+          <w:lang w:val="en-US"/>
+        </w:rPr>
+      </w:pPr>
+    </w:p>
+    <w:p>
+      <w:pPr>
+        <w:spacing w:after="120"/>
+        <w:rPr>
+          <w:b/>
+          <w:sz w:val="24"/>
+          <w:lang w:val="uk-UA"/>
+        </w:rPr>
+      </w:pPr>
       <w:r>
         <w:rPr>
+          <w:b/>
           <w:sz w:val="24"/>
-          <w:szCs w:val="24"/>
           <w:lang w:val="en-US"/>
         </w:rPr>
-        <w:t>, Photoshop;</w:t>
+        <w:t>LANGUAGES</w:t>
       </w:r>
     </w:p>
     <w:p>
       <w:pPr>
-        <w:numPr>
-          <w:ilvl w:val="0"/>
-          <w:numId w:val="23"/>
-        </w:numPr>
-        <w:jc w:val="both"/>
+        <w:spacing w:after="120"/>
         <w:rPr>
           <w:sz w:val="24"/>
-          <w:szCs w:val="24"/>
           <w:lang w:val="en-US"/>
         </w:rPr>
       </w:pPr>
       <w:r>
         <w:rPr>
           <w:sz w:val="24"/>
-          <w:szCs w:val="24"/>
           <w:lang w:val="en-US"/>
         </w:rPr>
-        <w:t>ski</w:t>
-      </w:r>
-      <w:r>
-        <w:rPr>
-          <w:sz w:val="24"/>
-          <w:szCs w:val="24"/>
-          <w:lang w:val="en-US"/>
-        </w:rPr>
-        <w:t xml:space="preserve">lls of working with CMS </w:t>
-      </w:r>
-      <w:r>
-        <w:rPr>
-          <w:sz w:val="24"/>
-          <w:szCs w:val="24"/>
-          <w:lang w:val="en-US"/>
-        </w:rPr>
-        <w:t>Word Press</w:t>
-      </w:r>
-      <w:r>
-        <w:rPr>
-          <w:sz w:val="24"/>
-          <w:szCs w:val="24"/>
-          <w:lang w:val="en-US"/>
-        </w:rPr>
-        <w:t>;</w:t>
+        <w:t>Ukrainian — Native</w:t>
       </w:r>
     </w:p>
     <w:p>
       <w:pPr>
-        <w:numPr>
-          <w:ilvl w:val="0"/>
-          <w:numId w:val="23"/>
-        </w:numPr>
-        <w:jc w:val="both"/>
+        <w:spacing w:after="120"/>
         <w:rPr>
           <w:sz w:val="24"/>
           <w:szCs w:val="24"/>
+          <w:lang w:val="uk-UA"/>
+        </w:rPr>
+      </w:pPr>
+      <w:r>
+        <w:rPr>
+          <w:sz w:val="24"/>
           <w:lang w:val="en-US"/>
         </w:rPr>
-      </w:pPr>
-      <w:r>
-        <w:rPr>
-          <w:sz w:val="24"/>
-          <w:szCs w:val="24"/>
-          <w:lang w:val="en-US"/>
-        </w:rPr>
-        <w:lastRenderedPageBreak/>
-        <w:t>English - Intermediate (</w:t>
-      </w:r>
-      <w:r>
-        <w:rPr>
-          <w:sz w:val="24"/>
-          <w:szCs w:val="24"/>
-          <w:lang w:val="en-US"/>
-        </w:rPr>
-        <w:t>B1</w:t>
-      </w:r>
-      <w:r>
-        <w:rPr>
-          <w:sz w:val="24"/>
-          <w:szCs w:val="24"/>
-          <w:lang w:val="en-US"/>
-        </w:rPr>
-        <w:t>).</w:t>
+        <w:t>English — Intermediate (B1)</w:t>
       </w:r>
     </w:p>
     <w:sectPr>
@@ -6324,7 +6184,6 @@
     <w:basedOn w:val="a"/>
     <w:next w:val="a"/>
     <w:link w:val="30"/>
-    <w:semiHidden/>
     <w:unhideWhenUsed/>
     <w:qFormat/>
     <w:rsid w:val="007116B5"/>
@@ -6472,7 +6331,6 @@
   <w:style w:type="character" w:customStyle="1" w:styleId="30">
     <w:name w:val="Заголовок 3 Знак"/>
     <w:link w:val="3"/>
-    <w:semiHidden/>
     <w:rsid w:val="007116B5"/>
     <w:rPr>
       <w:rFonts w:ascii="Cambria" w:eastAsia="Times New Roman" w:hAnsi="Cambria" w:cs="Times New Roman"/>
@@ -6510,46 +6368,36 @@
   <w:docDefaults>
     <w:rPrDefault>
       <w:rPr>
-        <w:rFonts w:asciiTheme="minorHAnsi" w:eastAsiaTheme="minorEastAsia" w:hAnsiTheme="minorHAnsi" w:cstheme="minorBidi"/>
-        <w:sz w:val="22"/>
-        <w:szCs w:val="22"/>
+        <w:rFonts w:ascii="Times New Roman" w:eastAsia="Times New Roman" w:hAnsi="Times New Roman" w:cs="Times New Roman"/>
         <w:lang w:val="ru-RU" w:eastAsia="ru-RU" w:bidi="ar-SA"/>
       </w:rPr>
     </w:rPrDefault>
-    <w:pPrDefault>
-      <w:pPr>
-        <w:spacing w:after="200" w:line="276" w:lineRule="auto"/>
-      </w:pPr>
-    </w:pPrDefault>
+    <w:pPrDefault/>
   </w:docDefaults>
-  <w:latentStyles w:defLockedState="0" w:defUIPriority="99" w:defSemiHidden="1" w:defUnhideWhenUsed="1" w:defQFormat="0" w:count="267">
-    <w:lsdException w:name="Normal" w:semiHidden="0" w:uiPriority="0" w:unhideWhenUsed="0" w:qFormat="1"/>
-    <w:lsdException w:name="heading 1" w:semiHidden="0" w:uiPriority="9" w:unhideWhenUsed="0" w:qFormat="1"/>
-    <w:lsdException w:name="heading 2" w:uiPriority="9" w:qFormat="1"/>
-    <w:lsdException w:name="heading 3" w:uiPriority="9" w:qFormat="1"/>
-    <w:lsdException w:name="heading 4" w:uiPriority="9" w:qFormat="1"/>
-    <w:lsdException w:name="heading 5" w:uiPriority="9" w:qFormat="1"/>
-    <w:lsdException w:name="heading 6" w:uiPriority="9" w:qFormat="1"/>
-    <w:lsdException w:name="heading 7" w:uiPriority="9" w:qFormat="1"/>
-    <w:lsdException w:name="heading 8" w:uiPriority="9" w:qFormat="1"/>
-    <w:lsdException w:name="heading 9" w:uiPriority="9" w:qFormat="1"/>
-    <w:lsdException w:name="toc 1" w:uiPriority="39"/>
-    <w:lsdException w:name="toc 2" w:uiPriority="39"/>
-    <w:lsdException w:name="toc 3" w:uiPriority="39"/>
-    <w:lsdException w:name="toc 4" w:uiPriority="39"/>
-    <w:lsdException w:name="toc 5" w:uiPriority="39"/>
-    <w:lsdException w:name="toc 6" w:uiPriority="39"/>
-    <w:lsdException w:name="toc 7" w:uiPriority="39"/>
-    <w:lsdException w:name="toc 8" w:uiPriority="39"/>
-    <w:lsdException w:name="toc 9" w:uiPriority="39"/>
-    <w:lsdException w:name="caption" w:uiPriority="35" w:qFormat="1"/>
-    <w:lsdException w:name="Title" w:semiHidden="0" w:uiPriority="10" w:unhideWhenUsed="0" w:qFormat="1"/>
-    <w:lsdException w:name="Default Paragraph Font" w:uiPriority="1"/>
-    <w:lsdException w:name="Subtitle" w:semiHidden="0" w:uiPriority="11" w:unhideWhenUsed="0" w:qFormat="1"/>
-    <w:lsdException w:name="Strong" w:semiHidden="0" w:uiPriority="22" w:unhideWhenUsed="0" w:qFormat="1"/>
-    <w:lsdException w:name="Emphasis" w:semiHidden="0" w:uiPriority="20" w:unhideWhenUsed="0" w:qFormat="1"/>
-    <w:lsdException w:name="Table Grid" w:semiHidden="0" w:uiPriority="59" w:unhideWhenUsed="0"/>
-    <w:lsdException w:name="Placeholder Text" w:unhideWhenUsed="0"/>
+  <w:latentStyles w:defLockedState="0" w:defUIPriority="0" w:defSemiHidden="1" w:defUnhideWhenUsed="1" w:defQFormat="0" w:count="267">
+    <w:lsdException w:name="Normal" w:semiHidden="0" w:unhideWhenUsed="0" w:qFormat="1"/>
+    <w:lsdException w:name="heading 1" w:semiHidden="0" w:unhideWhenUsed="0" w:qFormat="1"/>
+    <w:lsdException w:name="heading 2" w:qFormat="1"/>
+    <w:lsdException w:name="heading 3" w:qFormat="1"/>
+    <w:lsdException w:name="heading 4" w:qFormat="1"/>
+    <w:lsdException w:name="heading 5" w:qFormat="1"/>
+    <w:lsdException w:name="heading 6" w:qFormat="1"/>
+    <w:lsdException w:name="heading 7" w:qFormat="1"/>
+    <w:lsdException w:name="heading 8" w:qFormat="1"/>
+    <w:lsdException w:name="heading 9" w:qFormat="1"/>
+    <w:lsdException w:name="caption" w:qFormat="1"/>
+    <w:lsdException w:name="List Number" w:semiHidden="0" w:unhideWhenUsed="0"/>
+    <w:lsdException w:name="List 4" w:semiHidden="0" w:unhideWhenUsed="0"/>
+    <w:lsdException w:name="List 5" w:semiHidden="0" w:unhideWhenUsed="0"/>
+    <w:lsdException w:name="Title" w:semiHidden="0" w:unhideWhenUsed="0" w:qFormat="1"/>
+    <w:lsdException w:name="Subtitle" w:semiHidden="0" w:unhideWhenUsed="0" w:qFormat="1"/>
+    <w:lsdException w:name="Salutation" w:semiHidden="0" w:unhideWhenUsed="0"/>
+    <w:lsdException w:name="Date" w:semiHidden="0" w:unhideWhenUsed="0"/>
+    <w:lsdException w:name="Body Text First Indent" w:semiHidden="0" w:unhideWhenUsed="0"/>
+    <w:lsdException w:name="Strong" w:semiHidden="0" w:unhideWhenUsed="0" w:qFormat="1"/>
+    <w:lsdException w:name="Emphasis" w:semiHidden="0" w:unhideWhenUsed="0" w:qFormat="1"/>
+    <w:lsdException w:name="Table Grid" w:semiHidden="0" w:unhideWhenUsed="0"/>
+    <w:lsdException w:name="Placeholder Text" w:uiPriority="99" w:unhideWhenUsed="0"/>
     <w:lsdException w:name="No Spacing" w:semiHidden="0" w:uiPriority="1" w:unhideWhenUsed="0" w:qFormat="1"/>
     <w:lsdException w:name="Light Shading" w:semiHidden="0" w:uiPriority="60" w:unhideWhenUsed="0"/>
     <w:lsdException w:name="Light List" w:semiHidden="0" w:uiPriority="61" w:unhideWhenUsed="0"/>
@@ -6571,7 +6419,7 @@
     <w:lsdException w:name="Medium Shading 1 Accent 1" w:semiHidden="0" w:uiPriority="63" w:unhideWhenUsed="0"/>
     <w:lsdException w:name="Medium Shading 2 Accent 1" w:semiHidden="0" w:uiPriority="64" w:unhideWhenUsed="0"/>
     <w:lsdException w:name="Medium List 1 Accent 1" w:semiHidden="0" w:uiPriority="65" w:unhideWhenUsed="0"/>
-    <w:lsdException w:name="Revision" w:unhideWhenUsed="0"/>
+    <w:lsdException w:name="Revision" w:uiPriority="99" w:unhideWhenUsed="0"/>
     <w:lsdException w:name="List Paragraph" w:semiHidden="0" w:uiPriority="34" w:unhideWhenUsed="0" w:qFormat="1"/>
     <w:lsdException w:name="Quote" w:semiHidden="0" w:uiPriority="29" w:unhideWhenUsed="0" w:qFormat="1"/>
     <w:lsdException w:name="Intense Quote" w:semiHidden="0" w:uiPriority="30" w:unhideWhenUsed="0" w:qFormat="1"/>
@@ -6664,6 +6512,47 @@
   <w:style w:type="paragraph" w:default="1" w:styleId="a">
     <w:name w:val="Normal"/>
     <w:qFormat/>
+    <w:rsid w:val="00F14DDE"/>
+    <w:rPr>
+      <w:lang w:eastAsia="uk-UA"/>
+    </w:rPr>
+  </w:style>
+  <w:style w:type="paragraph" w:styleId="1">
+    <w:name w:val="heading 1"/>
+    <w:basedOn w:val="a"/>
+    <w:next w:val="a"/>
+    <w:qFormat/>
+    <w:rsid w:val="00670EF0"/>
+    <w:pPr>
+      <w:keepNext/>
+      <w:jc w:val="both"/>
+      <w:outlineLvl w:val="0"/>
+    </w:pPr>
+    <w:rPr>
+      <w:b/>
+      <w:sz w:val="24"/>
+    </w:rPr>
+  </w:style>
+  <w:style w:type="paragraph" w:styleId="3">
+    <w:name w:val="heading 3"/>
+    <w:basedOn w:val="a"/>
+    <w:next w:val="a"/>
+    <w:link w:val="30"/>
+    <w:unhideWhenUsed/>
+    <w:qFormat/>
+    <w:rsid w:val="007116B5"/>
+    <w:pPr>
+      <w:keepNext/>
+      <w:keepLines/>
+      <w:spacing w:before="40"/>
+      <w:outlineLvl w:val="2"/>
+    </w:pPr>
+    <w:rPr>
+      <w:rFonts w:ascii="Cambria" w:hAnsi="Cambria"/>
+      <w:color w:val="243F60"/>
+      <w:sz w:val="24"/>
+      <w:szCs w:val="24"/>
+    </w:rPr>
   </w:style>
   <w:style w:type="character" w:default="1" w:styleId="a0">
     <w:name w:val="Default Paragraph Font"/>
@@ -6691,6 +6580,139 @@
     <w:uiPriority w:val="99"/>
     <w:semiHidden/>
     <w:unhideWhenUsed/>
+  </w:style>
+  <w:style w:type="paragraph" w:styleId="a3">
+    <w:name w:val="Title"/>
+    <w:basedOn w:val="a"/>
+    <w:link w:val="a4"/>
+    <w:qFormat/>
+    <w:rsid w:val="00670EF0"/>
+    <w:pPr>
+      <w:jc w:val="center"/>
+    </w:pPr>
+    <w:rPr>
+      <w:b/>
+      <w:sz w:val="28"/>
+    </w:rPr>
+  </w:style>
+  <w:style w:type="paragraph" w:customStyle="1" w:styleId="a5">
+    <w:name w:val="Стиль"/>
+    <w:rsid w:val="00670EF0"/>
+    <w:pPr>
+      <w:jc w:val="both"/>
+    </w:pPr>
+    <w:rPr>
+      <w:lang w:eastAsia="uk-UA"/>
+    </w:rPr>
+  </w:style>
+  <w:style w:type="paragraph" w:styleId="a6">
+    <w:name w:val="Body Text"/>
+    <w:basedOn w:val="a"/>
+    <w:rsid w:val="00670EF0"/>
+    <w:pPr>
+      <w:spacing w:before="120"/>
+      <w:jc w:val="both"/>
+    </w:pPr>
+    <w:rPr>
+      <w:b/>
+      <w:sz w:val="28"/>
+    </w:rPr>
+  </w:style>
+  <w:style w:type="paragraph" w:styleId="a7">
+    <w:name w:val="Subtitle"/>
+    <w:basedOn w:val="a"/>
+    <w:qFormat/>
+    <w:rsid w:val="00670EF0"/>
+    <w:pPr>
+      <w:spacing w:before="120"/>
+      <w:jc w:val="center"/>
+    </w:pPr>
+    <w:rPr>
+      <w:sz w:val="24"/>
+    </w:rPr>
+  </w:style>
+  <w:style w:type="paragraph" w:styleId="2">
+    <w:name w:val="Body Text 2"/>
+    <w:basedOn w:val="a"/>
+    <w:rsid w:val="00670EF0"/>
+    <w:pPr>
+      <w:jc w:val="both"/>
+    </w:pPr>
+    <w:rPr>
+      <w:sz w:val="24"/>
+    </w:rPr>
+  </w:style>
+  <w:style w:type="paragraph" w:styleId="31">
+    <w:name w:val="Body Text 3"/>
+    <w:basedOn w:val="a"/>
+    <w:rsid w:val="00670EF0"/>
+    <w:rPr>
+      <w:sz w:val="24"/>
+    </w:rPr>
+  </w:style>
+  <w:style w:type="table" w:styleId="a8">
+    <w:name w:val="Table Grid"/>
+    <w:basedOn w:val="a1"/>
+    <w:rsid w:val="00CB4301"/>
+    <w:tblPr>
+      <w:tblBorders>
+        <w:top w:val="single" w:sz="4" w:space="0" w:color="auto"/>
+        <w:left w:val="single" w:sz="4" w:space="0" w:color="auto"/>
+        <w:bottom w:val="single" w:sz="4" w:space="0" w:color="auto"/>
+        <w:right w:val="single" w:sz="4" w:space="0" w:color="auto"/>
+        <w:insideH w:val="single" w:sz="4" w:space="0" w:color="auto"/>
+        <w:insideV w:val="single" w:sz="4" w:space="0" w:color="auto"/>
+      </w:tblBorders>
+    </w:tblPr>
+  </w:style>
+  <w:style w:type="character" w:styleId="a9">
+    <w:name w:val="Hyperlink"/>
+    <w:rsid w:val="005116D3"/>
+    <w:rPr>
+      <w:color w:val="0000FF"/>
+      <w:u w:val="single"/>
+    </w:rPr>
+  </w:style>
+  <w:style w:type="character" w:styleId="aa">
+    <w:name w:val="Strong"/>
+    <w:qFormat/>
+    <w:rsid w:val="007A5DBA"/>
+    <w:rPr>
+      <w:b/>
+      <w:bCs/>
+    </w:rPr>
+  </w:style>
+  <w:style w:type="character" w:customStyle="1" w:styleId="30">
+    <w:name w:val="Заголовок 3 Знак"/>
+    <w:link w:val="3"/>
+    <w:rsid w:val="007116B5"/>
+    <w:rPr>
+      <w:rFonts w:ascii="Cambria" w:eastAsia="Times New Roman" w:hAnsi="Cambria" w:cs="Times New Roman"/>
+      <w:color w:val="243F60"/>
+      <w:sz w:val="24"/>
+      <w:szCs w:val="24"/>
+      <w:lang w:eastAsia="uk-UA"/>
+    </w:rPr>
+  </w:style>
+  <w:style w:type="character" w:customStyle="1" w:styleId="a4">
+    <w:name w:val="Название Знак"/>
+    <w:link w:val="a3"/>
+    <w:rsid w:val="000F1A36"/>
+    <w:rPr>
+      <w:b/>
+      <w:sz w:val="28"/>
+      <w:lang w:val="ru-RU"/>
+    </w:rPr>
+  </w:style>
+  <w:style w:type="character" w:styleId="ab">
+    <w:name w:val="FollowedHyperlink"/>
+    <w:semiHidden/>
+    <w:unhideWhenUsed/>
+    <w:rsid w:val="00240A5B"/>
+    <w:rPr>
+      <w:color w:val="800080"/>
+      <w:u w:val="single"/>
+    </w:rPr>
   </w:style>
 </w:styles>
 </file>
@@ -6983,7 +7005,7 @@
 </file>
 
 <file path=customXml/itemProps1.xml><?xml version="1.0" encoding="utf-8"?>
-<ds:datastoreItem xmlns:ds="http://schemas.openxmlformats.org/officeDocument/2006/customXml" ds:itemID="{42F0C230-0D4F-42BE-AC99-D5761755754A}">
+<ds:datastoreItem xmlns:ds="http://schemas.openxmlformats.org/officeDocument/2006/customXml" ds:itemID="{20DB178F-23D6-4D34-8CDD-0E0CCFDF228C}">
   <ds:schemaRefs>
     <ds:schemaRef ds:uri="http://schemas.openxmlformats.org/officeDocument/2006/bibliography"/>
   </ds:schemaRefs>

</xml_diff>